<commit_message>
Update coffee pricing project details
</commit_message>
<xml_diff>
--- a/public/saranya_resume_pdf.docx
+++ b/public/saranya_resume_pdf.docx
@@ -167,7 +167,7 @@
           <w:sz w:val="21"/>
           <w:szCs w:val="21"/>
         </w:rPr>
-        <w:t>Data Analyst Intern</w:t>
+        <w:t xml:space="preserve">Data Analyst </w:t>
       </w:r>
       <w:r>
         <w:rPr>
@@ -175,7 +175,15 @@
           <w:sz w:val="21"/>
           <w:szCs w:val="21"/>
         </w:rPr>
-        <w:t xml:space="preserve">  |  </w:t>
+        <w:t xml:space="preserve"> </w:t>
+      </w:r>
+      <w:r>
+        <w:rPr>
+          <w:color w:val="888888"/>
+          <w:sz w:val="21"/>
+          <w:szCs w:val="21"/>
+        </w:rPr>
+        <w:t xml:space="preserve">|  </w:t>
       </w:r>
       <w:r>
         <w:rPr>

</xml_diff>